<commit_message>
Revisão por banca de juízes: dados, artigo, documentação e web
Três rodadas com quatro juízes (otimização, revisor SBC, nutrição e
reprodutibilidade, documentação e demo); na última, todos sem
considerações.

- Dados: coluna fonte (TACO/USDA/rótulo), fígado excluído pelo limite de
  vitamina A, DRIs de homem adulto (fibra 38 g, vitamina C 90 mg).
- Experimentos: E2 lexicográfico, pesos finos na soma ponderada, novo E8
  de sensibilidade do Genético (--somente-e8), mediana e pior execução.
- Artigo: dual com limites de porção, impacto com a linha de limites,
  cardápios de cinco perfis, textos alinhados aos novos números.
- Documentação: print novo da interface, cardápios legíveis, referências.
- Web: tempos esperados atualizados e cache dos estáticos (?v=6).

Co-Authored-By: Claude Opus 5.5 <noreply@anthropic.com>
</commit_message>
<xml_diff>
--- a/docs/Nutriliza_Documentacao.docx
+++ b/docs/Nutriliza_Documentacao.docx
@@ -496,7 +496,7 @@
           <w:sz w:val="22"/>
           <w:szCs w:val="22"/>
         </w:rPr>
-        <w:t xml:space="preserve">A base tem 37 alimentos comuns no Brasil, com composição da tabela TACO (NEPA-UNICAMP, 2011), porção caseira, preço e marcadores de carne, origem animal, lactose e glúten. A variável xᵢ é o número de porções do alimento i por dia, e aⱼᵢ é a quantidade do nutriente j em uma porção:</w:t>
+        <w:t xml:space="preserve">A base tem 37 alimentos comuns no Brasil, com composição da tabela TACO (NEPA-UNICAMP, 2011) para 30 deles, da base FoodData Central do USDA (2019) para cinco que não estão na TACO (grão-de-bico e macarrão cozidos, tilápia, pasta de amendoim e tofu) e de rótulos para a bebida de soja e o whey. Cada alimento tem porção caseira, preço e marcadores de carne, origem animal, lactose e glúten. A variável xᵢ é o número de porções do alimento i por dia, e aⱼᵢ é a quantidade do nutriente j em uma porção:</w:t>
       </w:r>
     </w:p>
     <w:p>
@@ -551,7 +551,7 @@
           <w:sz w:val="22"/>
           <w:szCs w:val="22"/>
         </w:rPr>
-        <w:t xml:space="preserve">Os nutrientes são energia, proteína, carboidrato, gordura, fibra, cálcio, ferro, sódio e vitamina C. No modelo linear as porções podem ser fracionadas; no modelo inteiro, não. Cada perfil muda os limites Lⱼ e Uⱼ e a lista de alimentos proibidos (Quadro 1).</w:t>
+        <w:t xml:space="preserve">Os nutrientes são energia, proteína, carboidrato, gordura, fibra, cálcio, ferro, sódio e vitamina C. No modelo linear as porções podem ser fracionadas; no modelo inteiro, não. Cada perfil muda os limites Lⱼ e Uⱼ e a lista de alimentos proibidos (Quadro 1). Todos os perfis são de homens adultos. Dois cuidados: o sódio é só o dos alimentos, porque as preparações da TACO são sem sal; e o fígado fica fora dos cardápios diários, porque 100 g passam várias vezes o limite de vitamina A, nutriente que o modelo não controla.</w:t>
       </w:r>
     </w:p>
     <w:p>
@@ -1570,6 +1570,7 @@
           </w:tcPr>
           <w:p>
             <w:pPr>
+              <w:keepNext/>
               <w:spacing w:before="0" w:after="0" w:line="240" w:lineRule="auto"/>
               <w:jc w:val="left"/>
             </w:pPr>
@@ -1590,6 +1591,7 @@
           </w:tcPr>
           <w:p>
             <w:pPr>
+              <w:keepNext/>
               <w:spacing w:before="0" w:after="0" w:line="240" w:lineRule="auto"/>
               <w:jc w:val="left"/>
             </w:pPr>
@@ -1609,6 +1611,7 @@
           </w:tcPr>
           <w:p>
             <w:pPr>
+              <w:keepNext/>
               <w:spacing w:before="0" w:after="0" w:line="240" w:lineRule="auto"/>
               <w:jc w:val="left"/>
             </w:pPr>
@@ -1628,6 +1631,7 @@
           </w:tcPr>
           <w:p>
             <w:pPr>
+              <w:keepNext/>
               <w:spacing w:before="0" w:after="0" w:line="240" w:lineRule="auto"/>
               <w:jc w:val="left"/>
             </w:pPr>
@@ -1647,6 +1651,7 @@
           </w:tcPr>
           <w:p>
             <w:pPr>
+              <w:keepNext/>
               <w:spacing w:before="0" w:after="0" w:line="240" w:lineRule="auto"/>
               <w:jc w:val="left"/>
             </w:pPr>
@@ -1673,7 +1678,7 @@
           <w:sz w:val="16"/>
           <w:szCs w:val="16"/>
         </w:rPr>
-        <w:t xml:space="preserve">Fonte: elaboração do grupo com base nas DRIs (IOM, 2006), na OMS (WHO, 2012) e em Thomas, Erdman e Burke (2016). Os demais limites estão em nutriliza/perfis.py.</w:t>
+        <w:t xml:space="preserve">Fonte: elaboração do grupo com base em INSTITUTE OF MEDICINE (2006), WORLD HEALTH ORGANIZATION (2012) e Thomas, Erdman e Burke (2016). Os demais limites estão em nutriliza/perfis.py.</w:t>
       </w:r>
     </w:p>
     <w:p>
@@ -1750,7 +1755,7 @@
           <w:sz w:val="22"/>
           <w:szCs w:val="22"/>
         </w:rPr>
-        <w:t xml:space="preserve">Os três métodos foram implementados pelo grupo em Python, sem bibliotecas de otimização; o resolvedor CBC foi usado só para conferir as respostas. Todos recebem o mesmo modelo e devolvem uma dieta, mas resolvem versões diferentes dele: o Simplex resolve o modelo linear (porções fracionadas), e o Branch and Bound e o Genético resolvem o modelo inteiro (porções inteiras). A Figura 1 mostra como as peças se ligam.</w:t>
+        <w:t xml:space="preserve">Os três métodos foram implementados pelo grupo em Python, sem bibliotecas de otimização; o resolvedor CBC (FORREST; LOUGEE-HEIMER, 2005) foi usado só para conferir as respostas. Todos recebem o mesmo modelo e devolvem uma dieta, mas resolvem versões diferentes dele: o Simplex resolve o modelo linear (porções fracionadas), e o Branch and Bound e o Genético resolvem o modelo inteiro (porções inteiras). A Figura 1 mostra como as peças se ligam.</w:t>
       </w:r>
     </w:p>
     <w:p>
@@ -2312,6 +2317,7 @@
           </w:tcPr>
           <w:p>
             <w:pPr>
+              <w:keepNext/>
               <w:spacing w:before="0" w:after="0" w:line="240" w:lineRule="auto"/>
               <w:jc w:val="left"/>
             </w:pPr>
@@ -2321,7 +2327,7 @@
                 <w:sz w:val="17"/>
                 <w:szCs w:val="17"/>
               </w:rPr>
-              <w:t xml:space="preserve">Arquivo</w:t>
+              <w:t xml:space="preserve">Arquivo (em nutriliza/)</w:t>
             </w:r>
           </w:p>
         </w:tc>
@@ -2332,15 +2338,16 @@
           </w:tcPr>
           <w:p>
             <w:pPr>
-              <w:spacing w:before="0" w:after="0" w:line="240" w:lineRule="auto"/>
-              <w:jc w:val="left"/>
-            </w:pPr>
-            <w:r>
-              <w:rPr>
-                <w:sz w:val="17"/>
-                <w:szCs w:val="17"/>
-              </w:rPr>
-              <w:t xml:space="preserve">nutriliza/simplex.py</w:t>
+              <w:keepNext/>
+              <w:spacing w:before="0" w:after="0" w:line="240" w:lineRule="auto"/>
+              <w:jc w:val="left"/>
+            </w:pPr>
+            <w:r>
+              <w:rPr>
+                <w:sz w:val="17"/>
+                <w:szCs w:val="17"/>
+              </w:rPr>
+              <w:t xml:space="preserve">simplex.py</w:t>
             </w:r>
           </w:p>
         </w:tc>
@@ -2351,15 +2358,16 @@
           </w:tcPr>
           <w:p>
             <w:pPr>
-              <w:spacing w:before="0" w:after="0" w:line="240" w:lineRule="auto"/>
-              <w:jc w:val="left"/>
-            </w:pPr>
-            <w:r>
-              <w:rPr>
-                <w:sz w:val="17"/>
-                <w:szCs w:val="17"/>
-              </w:rPr>
-              <w:t xml:space="preserve">nutriliza/branch_and_bound.py</w:t>
+              <w:keepNext/>
+              <w:spacing w:before="0" w:after="0" w:line="240" w:lineRule="auto"/>
+              <w:jc w:val="left"/>
+            </w:pPr>
+            <w:r>
+              <w:rPr>
+                <w:sz w:val="17"/>
+                <w:szCs w:val="17"/>
+              </w:rPr>
+              <w:t xml:space="preserve">branch_and_bound.py</w:t>
             </w:r>
           </w:p>
         </w:tc>
@@ -2370,15 +2378,16 @@
           </w:tcPr>
           <w:p>
             <w:pPr>
-              <w:spacing w:before="0" w:after="0" w:line="240" w:lineRule="auto"/>
-              <w:jc w:val="left"/>
-            </w:pPr>
-            <w:r>
-              <w:rPr>
-                <w:sz w:val="17"/>
-                <w:szCs w:val="17"/>
-              </w:rPr>
-              <w:t xml:space="preserve">nutriliza/genetico.py</w:t>
+              <w:keepNext/>
+              <w:spacing w:before="0" w:after="0" w:line="240" w:lineRule="auto"/>
+              <w:jc w:val="left"/>
+            </w:pPr>
+            <w:r>
+              <w:rPr>
+                <w:sz w:val="17"/>
+                <w:szCs w:val="17"/>
+              </w:rPr>
+              <w:t xml:space="preserve">genetico.py</w:t>
             </w:r>
           </w:p>
         </w:tc>
@@ -2550,7 +2559,7 @@
           <w:sz w:val="22"/>
           <w:szCs w:val="22"/>
         </w:rPr>
-        <w:t xml:space="preserve"> problemas de dieta têm muitos pivôs degenerados (que não mudam o custo). Depois de 50 seguidos, o método passa a usar a regra de Bland (menor índice), que garante que o algoritmo termina.</w:t>
+        <w:t xml:space="preserve"> problemas de dieta têm muitos pivôs degenerados (que não mudam o custo). Depois de 50 seguidos, o método passa a usar a regra de Bland (menor índice) (BLAND, 1977), que garante que o algoritmo termina.</w:t>
       </w:r>
     </w:p>
     <w:p>
@@ -2576,7 +2585,7 @@
           <w:sz w:val="22"/>
           <w:szCs w:val="22"/>
         </w:rPr>
-        <w:t xml:space="preserve"> na base ótima B, o sistema Bᵀy = c_B dá a variável dual yₖ de cada restrição. Ela diz quanto o custo mínimo sobe se a exigência k aumentar uma unidade; por exemplo, quanto custa 1 g a mais de proteína.</w:t>
+        <w:t xml:space="preserve"> na base ótima B, resolver Bᵀy = c, em que c são os custos das variáveis da base, dá a variável dual yₖ de cada restrição. Ela diz quanto o custo mínimo sobe se a exigência k aumentar uma unidade; por exemplo, quanto custa 1 g a mais de proteína.</w:t>
       </w:r>
     </w:p>
     <w:p>
@@ -2688,7 +2697,7 @@
           <w:sz w:val="22"/>
           <w:szCs w:val="22"/>
         </w:rPr>
-        <w:t xml:space="preserve"> É o método mais rápido (milissegundos) e o único que dá os preços-sombra, mas só resolve o modelo linear: a dieta pode sair com 2,53 copos de leite.</w:t>
+        <w:t xml:space="preserve"> É o método mais rápido (milissegundos) e o único que dá os preços-sombra, mas só resolve o modelo linear: a dieta do atleta sai com 2,34 porções de arroz integral cozido.</w:t>
       </w:r>
     </w:p>
     <w:p>
@@ -2724,7 +2733,7 @@
           <w:sz w:val="22"/>
           <w:szCs w:val="22"/>
         </w:rPr>
-        <w:t xml:space="preserve"> Para obter porções inteiras, não basta arredondar a solução do Simplex: o arredondamento pode violar alguma restrição ou deixar de ser o melhor. O Branch and Bound divide o problema em subproblemas menores (branch) e descarta os que não podem conter a melhor dieta (bound), usando o Simplex para avaliar cada um.</w:t>
+        <w:t xml:space="preserve"> Para obter porções inteiras, não basta arredondar a solução do Simplex: o arredondamento pode violar alguma restrição ou deixar de ser o melhor. O Branch and Bound divide o problema em subproblemas menores (branch) e descarta os que não podem conter a melhor dieta (bound), usando o Simplex para avaliar cada um (LAND; DOIG, 1960).</w:t>
       </w:r>
     </w:p>
     <w:p>
@@ -2889,7 +2898,7 @@
           <w:sz w:val="22"/>
           <w:szCs w:val="22"/>
         </w:rPr>
-        <w:t xml:space="preserve"> Na dieta de custo mínimo do atleta, o Simplex sugere 2,53 copos de leite e 0,85 bife de fígado, entre outras porções fracionadas. O Branch and Bound cria os ramos "leite ≤ 2" e "leite ≥ 3", resolve cada um com o Simplex e continua ramificando as porções que ainda saem fracionadas. A dieta inteira ótima custa R$ 14,45, contra R$ 13,99 da versão fracionada.</w:t>
+        <w:t xml:space="preserve"> Na dieta de custo mínimo do atleta, o Simplex sugere 2,34 porções de arroz integral cozido, entre outras porções fracionadas; essa é a mais fracionária. O Branch and Bound cria os ramos "arroz integral cozido ≤ 2" e "arroz integral cozido ≥ 3", resolve cada um com o Simplex e continua ramificando as porções que ainda saem fracionadas. A dieta inteira ótima custa R$ 14,65, contra R$ 14,11 da versão fracionária.</w:t>
       </w:r>
     </w:p>
     <w:p>
@@ -2980,7 +2989,7 @@
           <w:sz w:val="22"/>
           <w:szCs w:val="22"/>
         </w:rPr>
-        <w:t xml:space="preserve"> É a escolha para o modelo inteiro: garante o ótimo. Neste problema explorou em média 526 nós e levou poucos segundos, mas o número de nós pode crescer muito em modelos maiores.</w:t>
+        <w:t xml:space="preserve"> É a escolha para o modelo inteiro: garante o ótimo. Neste problema explorou em média 527 nós e levou poucos segundos, mas o número de nós pode crescer muito em modelos maiores.</w:t>
       </w:r>
     </w:p>
     <w:p>
@@ -3016,7 +3025,7 @@
           <w:sz w:val="22"/>
           <w:szCs w:val="22"/>
         </w:rPr>
-        <w:t xml:space="preserve"> Inspirado na evolução natural, o Algoritmo Genético mantém uma população de dietas que se combinam e sofrem pequenas mudanças. As melhores têm mais chance de passar adiante, e a população melhora geração após geração. Não usa o Simplex nem precisa que o modelo seja linear, mas não garante o ótimo.</w:t>
+        <w:t xml:space="preserve"> Inspirado na evolução natural, o Algoritmo Genético mantém uma população de dietas que se combinam e sofrem pequenas mudanças. As melhores têm mais chance de passar adiante, e a população melhora geração após geração (HOLLAND, 1975). Não usa o Simplex nem precisa que o modelo seja linear, mas não garante o ótimo.</w:t>
       </w:r>
     </w:p>
     <w:p>
@@ -3197,7 +3206,7 @@
           <w:sz w:val="22"/>
           <w:szCs w:val="22"/>
         </w:rPr>
-        <w:t xml:space="preserve">Seleção (torneio binário com regras de Deb):</w:t>
+        <w:t xml:space="preserve">Seleção (torneio binário com regras de Deb (DEB, 2000)):</w:t>
       </w:r>
       <w:r>
         <w:rPr>
@@ -3256,7 +3265,7 @@
           <w:sz w:val="22"/>
           <w:szCs w:val="22"/>
         </w:rPr>
-        <w:t xml:space="preserve"> cada gene tem chance de 1,5/37 (cerca de 4%) de ganhar ou perder uma porção, o que muda em média 1,5 alimento por filho, e chance quatro vezes menor de ser sorteado de novo.</w:t>
+        <w:t xml:space="preserve"> cada gene tem chance de 1,5/37 (cerca de 4%) de ganhar ou perder uma porção, o que muda em média 1,5 alimento por filho, e chance quatro vezes menor de receber um valor novo, sorteado entre 0 e Mᵢ.</w:t>
       </w:r>
     </w:p>
     <w:p>
@@ -3548,7 +3557,7 @@
           <w:sz w:val="22"/>
           <w:szCs w:val="22"/>
         </w:rPr>
-        <w:t xml:space="preserve">O atleta custa R$ 13,99, 55% a mais, pela energia e proteína maiores. Sem carnes, sobe para R$ 14,21.</w:t>
+        <w:t xml:space="preserve">O atleta custa R$ 14,11, 57% a mais, pela energia e proteína maiores. Sem carnes, sobe para R$ 14,21.</w:t>
       </w:r>
     </w:p>
     <w:p>
@@ -3576,7 +3585,7 @@
           <w:sz w:val="22"/>
           <w:szCs w:val="22"/>
         </w:rPr>
-        <w:t xml:space="preserve">Os critérios conflitam. Para o atleta, maximizar proteína custa R$ 24,04 por dia, contra R$ 13,99 da dieta mais barata. Os preços-sombra mostram o que encarece cada dieta:</w:t>
+        <w:t xml:space="preserve">Os critérios conflitam. Para o atleta, maximizar proteína custa R$ 18,28 por dia, contra R$ 14,11 da dieta mais barata. Os preços-sombra mostram o que encarece cada dieta:</w:t>
       </w:r>
     </w:p>
     <w:p>
@@ -3594,7 +3603,7 @@
           <w:sz w:val="22"/>
           <w:szCs w:val="22"/>
         </w:rPr>
-        <w:t xml:space="preserve">Cada grama a mais de proteína custa R$ 0,07 ao atleta e R$ 0,11 ao atleta vegetariano.</w:t>
+        <w:t xml:space="preserve">Cada grama a mais de proteína custa R$ 0,08 ao atleta e R$ 0,11 ao atleta vegetariano.</w:t>
       </w:r>
     </w:p>
     <w:p>
@@ -3934,7 +3943,7 @@
                 <w:sz w:val="17"/>
                 <w:szCs w:val="17"/>
               </w:rPr>
-              <w:t xml:space="preserve">1,3 s</w:t>
+              <w:t xml:space="preserve">3,9 s</w:t>
             </w:r>
           </w:p>
         </w:tc>
@@ -3954,7 +3963,7 @@
                 <w:sz w:val="17"/>
                 <w:szCs w:val="17"/>
               </w:rPr>
-              <w:t xml:space="preserve">3,2%</w:t>
+              <w:t xml:space="preserve">3,4%</w:t>
             </w:r>
           </w:p>
         </w:tc>
@@ -3974,7 +3983,7 @@
                 <w:sz w:val="17"/>
                 <w:szCs w:val="17"/>
               </w:rPr>
-              <w:t xml:space="preserve">7%</w:t>
+              <w:t xml:space="preserve">10%</w:t>
             </w:r>
           </w:p>
         </w:tc>
@@ -3994,7 +4003,7 @@
                 <w:sz w:val="17"/>
                 <w:szCs w:val="17"/>
               </w:rPr>
-              <w:t xml:space="preserve">3,2 s</w:t>
+              <w:t xml:space="preserve">9,4 s</w:t>
             </w:r>
           </w:p>
         </w:tc>
@@ -4040,7 +4049,7 @@
                 <w:sz w:val="17"/>
                 <w:szCs w:val="17"/>
               </w:rPr>
-              <w:t xml:space="preserve">0,4 s</w:t>
+              <w:t xml:space="preserve">1,3 s</w:t>
             </w:r>
           </w:p>
         </w:tc>
@@ -4060,7 +4069,7 @@
                 <w:sz w:val="17"/>
                 <w:szCs w:val="17"/>
               </w:rPr>
-              <w:t xml:space="preserve">10,5%</w:t>
+              <w:t xml:space="preserve">10,6%</w:t>
             </w:r>
           </w:p>
         </w:tc>
@@ -4080,7 +4089,7 @@
                 <w:sz w:val="17"/>
                 <w:szCs w:val="17"/>
               </w:rPr>
-              <w:t xml:space="preserve">26%</w:t>
+              <w:t xml:space="preserve">27%</w:t>
             </w:r>
           </w:p>
         </w:tc>
@@ -4100,7 +4109,7 @@
                 <w:sz w:val="17"/>
                 <w:szCs w:val="17"/>
               </w:rPr>
-              <w:t xml:space="preserve">3,2 s</w:t>
+              <w:t xml:space="preserve">9,2 s</w:t>
             </w:r>
           </w:p>
         </w:tc>
@@ -4116,6 +4125,7 @@
           </w:tcPr>
           <w:p>
             <w:pPr>
+              <w:keepNext/>
               <w:spacing w:before="0" w:after="0" w:line="240" w:lineRule="auto"/>
               <w:jc w:val="left"/>
             </w:pPr>
@@ -4136,6 +4146,7 @@
           </w:tcPr>
           <w:p>
             <w:pPr>
+              <w:keepNext/>
               <w:spacing w:before="0" w:after="0" w:line="240" w:lineRule="auto"/>
               <w:jc w:val="right"/>
             </w:pPr>
@@ -4144,7 +4155,7 @@
                 <w:sz w:val="17"/>
                 <w:szCs w:val="17"/>
               </w:rPr>
-              <w:t xml:space="preserve">1,5 s</w:t>
+              <w:t xml:space="preserve">4,3 s</w:t>
             </w:r>
           </w:p>
         </w:tc>
@@ -4155,6 +4166,7 @@
           </w:tcPr>
           <w:p>
             <w:pPr>
+              <w:keepNext/>
               <w:spacing w:before="0" w:after="0" w:line="240" w:lineRule="auto"/>
               <w:jc w:val="right"/>
             </w:pPr>
@@ -4174,6 +4186,7 @@
           </w:tcPr>
           <w:p>
             <w:pPr>
+              <w:keepNext/>
               <w:spacing w:before="0" w:after="0" w:line="240" w:lineRule="auto"/>
               <w:jc w:val="right"/>
             </w:pPr>
@@ -4182,7 +4195,7 @@
                 <w:sz w:val="17"/>
                 <w:szCs w:val="17"/>
               </w:rPr>
-              <w:t xml:space="preserve">11%</w:t>
+              <w:t xml:space="preserve">8%</w:t>
             </w:r>
           </w:p>
         </w:tc>
@@ -4193,6 +4206,7 @@
           </w:tcPr>
           <w:p>
             <w:pPr>
+              <w:keepNext/>
               <w:spacing w:before="0" w:after="0" w:line="240" w:lineRule="auto"/>
               <w:jc w:val="right"/>
             </w:pPr>
@@ -4201,7 +4215,7 @@
                 <w:sz w:val="17"/>
                 <w:szCs w:val="17"/>
               </w:rPr>
-              <w:t xml:space="preserve">3,2 s</w:t>
+              <w:t xml:space="preserve">8,9 s</w:t>
             </w:r>
           </w:p>
         </w:tc>
@@ -4232,7 +4246,7 @@
           <w:sz w:val="22"/>
           <w:szCs w:val="22"/>
         </w:rPr>
-        <w:t xml:space="preserve">O Branch and Bound é a melhor escolha neste problema: garante o ótimo e roda em poucos segundos. O Genético sempre achou dietas válidas, mas ficou em média 5,9% acima do ótimo. Exigir porções inteiras encarece a dieta de custo mínimo em média 4,7% em relação ao modelo linear.</w:t>
+        <w:t xml:space="preserve">O Branch and Bound é a melhor escolha neste problema: garante o ótimo e roda em poucos segundos. O Genético sempre achou dietas válidas, mas ficou em média 6,0% acima do ótimo. Exigir porções inteiras encarece a dieta de custo mínimo em média 4,7% em relação ao modelo linear.</w:t>
       </w:r>
     </w:p>
     <w:p>
@@ -4247,7 +4261,7 @@
           <w:sz w:val="22"/>
           <w:szCs w:val="22"/>
         </w:rPr>
-        <w:t xml:space="preserve">5.4 Exemplo de cardápio</w:t>
+        <w:t xml:space="preserve">5.4 Cardápios</w:t>
       </w:r>
     </w:p>
     <w:p>
@@ -4262,7 +4276,7 @@
           <w:sz w:val="17"/>
           <w:szCs w:val="17"/>
         </w:rPr>
-        <w:t xml:space="preserve">Tabela 3 – Cardápio de custo mínimo do atleta (porções inteiras)</w:t>
+        <w:t xml:space="preserve">Tabela 3 – Cardápios de custo mínimo (porções inteiras) de cinco perfis</w:t>
       </w:r>
     </w:p>
     <w:tbl>
@@ -4285,10 +4299,9 @@
         </w:tblCellMar>
       </w:tblPr>
       <w:tblGrid>
-        <w:gridCol w:w="3761"/>
-        <w:gridCol w:w="1175"/>
-        <w:gridCol w:w="3291"/>
-        <w:gridCol w:w="1411"/>
+        <w:gridCol w:w="2019"/>
+        <w:gridCol w:w="6608"/>
+        <w:gridCol w:w="1011"/>
       </w:tblGrid>
       <w:tr>
         <w:trPr>
@@ -4297,7 +4310,7 @@
         </w:trPr>
         <w:tc>
           <w:tcPr>
-            <w:tcW w:w="3761" w:type="dxa"/>
+            <w:tcW w:w="2019" w:type="dxa"/>
             <w:shd w:val="clear" w:color="auto" w:fill="D9D9D9"/>
             <w:vAlign w:val="center"/>
           </w:tcPr>
@@ -4313,13 +4326,13 @@
                 <w:sz w:val="17"/>
                 <w:szCs w:val="17"/>
               </w:rPr>
-              <w:t xml:space="preserve">Alimento</w:t>
-            </w:r>
-          </w:p>
-        </w:tc>
-        <w:tc>
-          <w:tcPr>
-            <w:tcW w:w="1175" w:type="dxa"/>
+              <w:t xml:space="preserve">Perfil</w:t>
+            </w:r>
+          </w:p>
+        </w:tc>
+        <w:tc>
+          <w:tcPr>
+            <w:tcW w:w="6608" w:type="dxa"/>
             <w:shd w:val="clear" w:color="auto" w:fill="D9D9D9"/>
             <w:vAlign w:val="center"/>
           </w:tcPr>
@@ -4327,7 +4340,7 @@
             <w:pPr>
               <w:keepNext/>
               <w:spacing w:before="0" w:after="0" w:line="240" w:lineRule="auto"/>
-              <w:jc w:val="right"/>
+              <w:jc w:val="left"/>
             </w:pPr>
             <w:r>
               <w:rPr>
@@ -4335,35 +4348,13 @@
                 <w:sz w:val="17"/>
                 <w:szCs w:val="17"/>
               </w:rPr>
-              <w:t xml:space="preserve">Porções</w:t>
-            </w:r>
-          </w:p>
-        </w:tc>
-        <w:tc>
-          <w:tcPr>
-            <w:tcW w:w="3291" w:type="dxa"/>
-            <w:shd w:val="clear" w:color="auto" w:fill="D9D9D9"/>
-            <w:vAlign w:val="center"/>
-          </w:tcPr>
-          <w:p>
-            <w:pPr>
-              <w:keepNext/>
-              <w:spacing w:before="0" w:after="0" w:line="240" w:lineRule="auto"/>
-              <w:jc w:val="left"/>
-            </w:pPr>
-            <w:r>
-              <w:rPr>
-                <w:b/>
-                <w:sz w:val="17"/>
-                <w:szCs w:val="17"/>
-              </w:rPr>
-              <w:t xml:space="preserve">Medida caseira</w:t>
-            </w:r>
-          </w:p>
-        </w:tc>
-        <w:tc>
-          <w:tcPr>
-            <w:tcW w:w="1411" w:type="dxa"/>
+              <w:t xml:space="preserve">Cardápio diário</w:t>
+            </w:r>
+          </w:p>
+        </w:tc>
+        <w:tc>
+          <w:tcPr>
+            <w:tcW w:w="1011" w:type="dxa"/>
             <w:shd w:val="clear" w:color="auto" w:fill="D9D9D9"/>
             <w:vAlign w:val="center"/>
           </w:tcPr>
@@ -4390,7 +4381,7 @@
         </w:trPr>
         <w:tc>
           <w:tcPr>
-            <w:tcW w:w="3761" w:type="dxa"/>
+            <w:tcW w:w="2019" w:type="dxa"/>
             <w:vAlign w:val="center"/>
           </w:tcPr>
           <w:p>
@@ -4405,13 +4396,33 @@
                 <w:sz w:val="17"/>
                 <w:szCs w:val="17"/>
               </w:rPr>
-              <w:t xml:space="preserve">Arroz branco cozido</w:t>
-            </w:r>
-          </w:p>
-        </w:tc>
-        <w:tc>
-          <w:tcPr>
-            <w:tcW w:w="1175" w:type="dxa"/>
+              <w:t xml:space="preserve">Sobrepeso (emagrecimento)</w:t>
+            </w:r>
+          </w:p>
+        </w:tc>
+        <w:tc>
+          <w:tcPr>
+            <w:tcW w:w="6608" w:type="dxa"/>
+            <w:vAlign w:val="center"/>
+          </w:tcPr>
+          <w:p>
+            <w:pPr>
+              <w:keepNext/>
+              <w:spacing w:before="0" w:after="0" w:line="240" w:lineRule="auto"/>
+              <w:jc w:val="left"/>
+            </w:pPr>
+            <w:r>
+              <w:rPr>
+                <w:sz w:val="17"/>
+                <w:szCs w:val="17"/>
+              </w:rPr>
+              <w:t xml:space="preserve">1 × 1 prato raso de macarrão cozido; 3 × 1 concha de feijão carioca cozido; 2 × 1 concha pequena de grão-de-bico cozido; 2 × 1/2 lata de sardinha em conserva; 3 × 1 unidade de ovo cozido; 2 × 1 unidade de laranja pera; 1 × 3 colheres de sopa de cenoura crua</w:t>
+            </w:r>
+          </w:p>
+        </w:tc>
+        <w:tc>
+          <w:tcPr>
+            <w:tcW w:w="1011" w:type="dxa"/>
             <w:vAlign w:val="center"/>
           </w:tcPr>
           <w:p>
@@ -4425,47 +4436,7 @@
                 <w:sz w:val="17"/>
                 <w:szCs w:val="17"/>
               </w:rPr>
-              <w:t xml:space="preserve">3</w:t>
-            </w:r>
-          </w:p>
-        </w:tc>
-        <w:tc>
-          <w:tcPr>
-            <w:tcW w:w="3291" w:type="dxa"/>
-            <w:vAlign w:val="center"/>
-          </w:tcPr>
-          <w:p>
-            <w:pPr>
-              <w:keepNext/>
-              <w:spacing w:before="0" w:after="0" w:line="240" w:lineRule="auto"/>
-              <w:jc w:val="left"/>
-            </w:pPr>
-            <w:r>
-              <w:rPr>
-                <w:sz w:val="17"/>
-                <w:szCs w:val="17"/>
-              </w:rPr>
-              <w:t xml:space="preserve">1 escumadeira cheia</w:t>
-            </w:r>
-          </w:p>
-        </w:tc>
-        <w:tc>
-          <w:tcPr>
-            <w:tcW w:w="1411" w:type="dxa"/>
-            <w:vAlign w:val="center"/>
-          </w:tcPr>
-          <w:p>
-            <w:pPr>
-              <w:keepNext/>
-              <w:spacing w:before="0" w:after="0" w:line="240" w:lineRule="auto"/>
-              <w:jc w:val="right"/>
-            </w:pPr>
-            <w:r>
-              <w:rPr>
-                <w:sz w:val="17"/>
-                <w:szCs w:val="17"/>
-              </w:rPr>
-              <w:t xml:space="preserve">R$ 0,90</w:t>
+              <w:t xml:space="preserve">R$ 10,90</w:t>
             </w:r>
           </w:p>
         </w:tc>
@@ -4476,7 +4447,7 @@
         </w:trPr>
         <w:tc>
           <w:tcPr>
-            <w:tcW w:w="3761" w:type="dxa"/>
+            <w:tcW w:w="2019" w:type="dxa"/>
             <w:vAlign w:val="center"/>
           </w:tcPr>
           <w:p>
@@ -4491,13 +4462,33 @@
                 <w:sz w:val="17"/>
                 <w:szCs w:val="17"/>
               </w:rPr>
-              <w:t xml:space="preserve">Arroz integral cozido</w:t>
-            </w:r>
-          </w:p>
-        </w:tc>
-        <w:tc>
-          <w:tcPr>
-            <w:tcW w:w="1175" w:type="dxa"/>
+              <w:t xml:space="preserve">Subpeso (ganho de peso)</w:t>
+            </w:r>
+          </w:p>
+        </w:tc>
+        <w:tc>
+          <w:tcPr>
+            <w:tcW w:w="6608" w:type="dxa"/>
+            <w:vAlign w:val="center"/>
+          </w:tcPr>
+          <w:p>
+            <w:pPr>
+              <w:keepNext/>
+              <w:spacing w:before="0" w:after="0" w:line="240" w:lineRule="auto"/>
+              <w:jc w:val="left"/>
+            </w:pPr>
+            <w:r>
+              <w:rPr>
+                <w:sz w:val="17"/>
+                <w:szCs w:val="17"/>
+              </w:rPr>
+              <w:t xml:space="preserve">3 × 1 escumadeira cheia de arroz branco cozido; 3 × 1 escumadeira cheia de arroz integral cozido; 2 × 1 prato raso de macarrão cozido; 3 × 1 concha de feijão carioca cozido; 1 × 1/2 lata de sardinha em conserva; 1 × 1 copo de leite integral; 1 × 1 colher de sopa de pasta de amendoim integral; 3 × 1 colher de sopa de azeite de oliva; 1 × 1 unidade de laranja pera; 2 × 2 colheres de sopa de couve manteiga refogada; 2 × 3 colheres de sopa de cenoura crua</w:t>
+            </w:r>
+          </w:p>
+        </w:tc>
+        <w:tc>
+          <w:tcPr>
+            <w:tcW w:w="1011" w:type="dxa"/>
             <w:vAlign w:val="center"/>
           </w:tcPr>
           <w:p>
@@ -4511,47 +4502,7 @@
                 <w:sz w:val="17"/>
                 <w:szCs w:val="17"/>
               </w:rPr>
-              <w:t xml:space="preserve">3</w:t>
-            </w:r>
-          </w:p>
-        </w:tc>
-        <w:tc>
-          <w:tcPr>
-            <w:tcW w:w="3291" w:type="dxa"/>
-            <w:vAlign w:val="center"/>
-          </w:tcPr>
-          <w:p>
-            <w:pPr>
-              <w:keepNext/>
-              <w:spacing w:before="0" w:after="0" w:line="240" w:lineRule="auto"/>
-              <w:jc w:val="left"/>
-            </w:pPr>
-            <w:r>
-              <w:rPr>
-                <w:sz w:val="17"/>
-                <w:szCs w:val="17"/>
-              </w:rPr>
-              <w:t xml:space="preserve">1 escumadeira cheia</w:t>
-            </w:r>
-          </w:p>
-        </w:tc>
-        <w:tc>
-          <w:tcPr>
-            <w:tcW w:w="1411" w:type="dxa"/>
-            <w:vAlign w:val="center"/>
-          </w:tcPr>
-          <w:p>
-            <w:pPr>
-              <w:keepNext/>
-              <w:spacing w:before="0" w:after="0" w:line="240" w:lineRule="auto"/>
-              <w:jc w:val="right"/>
-            </w:pPr>
-            <w:r>
-              <w:rPr>
-                <w:sz w:val="17"/>
-                <w:szCs w:val="17"/>
-              </w:rPr>
-              <w:t xml:space="preserve">R$ 1,35</w:t>
+              <w:t xml:space="preserve">R$ 12,03</w:t>
             </w:r>
           </w:p>
         </w:tc>
@@ -4562,7 +4513,7 @@
         </w:trPr>
         <w:tc>
           <w:tcPr>
-            <w:tcW w:w="3761" w:type="dxa"/>
+            <w:tcW w:w="2019" w:type="dxa"/>
             <w:vAlign w:val="center"/>
           </w:tcPr>
           <w:p>
@@ -4577,13 +4528,33 @@
                 <w:sz w:val="17"/>
                 <w:szCs w:val="17"/>
               </w:rPr>
-              <w:t xml:space="preserve">Macarrão cozido</w:t>
-            </w:r>
-          </w:p>
-        </w:tc>
-        <w:tc>
-          <w:tcPr>
-            <w:tcW w:w="1175" w:type="dxa"/>
+              <w:t xml:space="preserve">Atleta (força)</w:t>
+            </w:r>
+          </w:p>
+        </w:tc>
+        <w:tc>
+          <w:tcPr>
+            <w:tcW w:w="6608" w:type="dxa"/>
+            <w:vAlign w:val="center"/>
+          </w:tcPr>
+          <w:p>
+            <w:pPr>
+              <w:keepNext/>
+              <w:spacing w:before="0" w:after="0" w:line="240" w:lineRule="auto"/>
+              <w:jc w:val="left"/>
+            </w:pPr>
+            <w:r>
+              <w:rPr>
+                <w:sz w:val="17"/>
+                <w:szCs w:val="17"/>
+              </w:rPr>
+              <w:t xml:space="preserve">3 × 1 escumadeira cheia de arroz branco cozido; 3 × 1 escumadeira cheia de arroz integral cozido; 2 × 1 prato raso de macarrão cozido; 3 × 1 concha de feijão carioca cozido; 2 × 1 concha pequena de grão-de-bico cozido; 3 × 1 unidade de ovo cozido; 2 × 1 copo de leite desnatado; 3 × 1 colher de sopa de pasta de amendoim integral; 2 × 1 unidade de laranja pera; 1 × 3 colheres de sopa de cenoura crua</w:t>
+            </w:r>
+          </w:p>
+        </w:tc>
+        <w:tc>
+          <w:tcPr>
+            <w:tcW w:w="1011" w:type="dxa"/>
             <w:vAlign w:val="center"/>
           </w:tcPr>
           <w:p>
@@ -4597,47 +4568,7 @@
                 <w:sz w:val="17"/>
                 <w:szCs w:val="17"/>
               </w:rPr>
-              <w:t xml:space="preserve">2</w:t>
-            </w:r>
-          </w:p>
-        </w:tc>
-        <w:tc>
-          <w:tcPr>
-            <w:tcW w:w="3291" w:type="dxa"/>
-            <w:vAlign w:val="center"/>
-          </w:tcPr>
-          <w:p>
-            <w:pPr>
-              <w:keepNext/>
-              <w:spacing w:before="0" w:after="0" w:line="240" w:lineRule="auto"/>
-              <w:jc w:val="left"/>
-            </w:pPr>
-            <w:r>
-              <w:rPr>
-                <w:sz w:val="17"/>
-                <w:szCs w:val="17"/>
-              </w:rPr>
-              <w:t xml:space="preserve">1 prato raso</w:t>
-            </w:r>
-          </w:p>
-        </w:tc>
-        <w:tc>
-          <w:tcPr>
-            <w:tcW w:w="1411" w:type="dxa"/>
-            <w:vAlign w:val="center"/>
-          </w:tcPr>
-          <w:p>
-            <w:pPr>
-              <w:keepNext/>
-              <w:spacing w:before="0" w:after="0" w:line="240" w:lineRule="auto"/>
-              <w:jc w:val="right"/>
-            </w:pPr>
-            <w:r>
-              <w:rPr>
-                <w:sz w:val="17"/>
-                <w:szCs w:val="17"/>
-              </w:rPr>
-              <w:t xml:space="preserve">R$ 1,20</w:t>
+              <w:t xml:space="preserve">R$ 14,65</w:t>
             </w:r>
           </w:p>
         </w:tc>
@@ -4648,7 +4579,7 @@
         </w:trPr>
         <w:tc>
           <w:tcPr>
-            <w:tcW w:w="3761" w:type="dxa"/>
+            <w:tcW w:w="2019" w:type="dxa"/>
             <w:vAlign w:val="center"/>
           </w:tcPr>
           <w:p>
@@ -4663,13 +4594,33 @@
                 <w:sz w:val="17"/>
                 <w:szCs w:val="17"/>
               </w:rPr>
-              <w:t xml:space="preserve">Feijão carioca cozido</w:t>
-            </w:r>
-          </w:p>
-        </w:tc>
-        <w:tc>
-          <w:tcPr>
-            <w:tcW w:w="1175" w:type="dxa"/>
+              <w:t xml:space="preserve">Vegetariano (ovolactovegetariano)</w:t>
+            </w:r>
+          </w:p>
+        </w:tc>
+        <w:tc>
+          <w:tcPr>
+            <w:tcW w:w="6608" w:type="dxa"/>
+            <w:vAlign w:val="center"/>
+          </w:tcPr>
+          <w:p>
+            <w:pPr>
+              <w:keepNext/>
+              <w:spacing w:before="0" w:after="0" w:line="240" w:lineRule="auto"/>
+              <w:jc w:val="left"/>
+            </w:pPr>
+            <w:r>
+              <w:rPr>
+                <w:sz w:val="17"/>
+                <w:szCs w:val="17"/>
+              </w:rPr>
+              <w:t xml:space="preserve">2 × 1 escumadeira cheia de arroz branco cozido; 2 × 1 escumadeira cheia de arroz integral cozido; 3 × 1 concha de feijão carioca cozido; 2 × 1 concha pequena de grão-de-bico cozido; 1 × 1 unidade de ovo cozido; 2 × 1 copo de leite integral; 1 × 1 colher de sopa de azeite de oliva; 2 × 1 unidade de laranja pera; 2 × 2 colheres de sopa de couve manteiga refogada</w:t>
+            </w:r>
+          </w:p>
+        </w:tc>
+        <w:tc>
+          <w:tcPr>
+            <w:tcW w:w="1011" w:type="dxa"/>
             <w:vAlign w:val="center"/>
           </w:tcPr>
           <w:p>
@@ -4683,47 +4634,7 @@
                 <w:sz w:val="17"/>
                 <w:szCs w:val="17"/>
               </w:rPr>
-              <w:t xml:space="preserve">3</w:t>
-            </w:r>
-          </w:p>
-        </w:tc>
-        <w:tc>
-          <w:tcPr>
-            <w:tcW w:w="3291" w:type="dxa"/>
-            <w:vAlign w:val="center"/>
-          </w:tcPr>
-          <w:p>
-            <w:pPr>
-              <w:keepNext/>
-              <w:spacing w:before="0" w:after="0" w:line="240" w:lineRule="auto"/>
-              <w:jc w:val="left"/>
-            </w:pPr>
-            <w:r>
-              <w:rPr>
-                <w:sz w:val="17"/>
-                <w:szCs w:val="17"/>
-              </w:rPr>
-              <w:t xml:space="preserve">1 concha</w:t>
-            </w:r>
-          </w:p>
-        </w:tc>
-        <w:tc>
-          <w:tcPr>
-            <w:tcW w:w="1411" w:type="dxa"/>
-            <w:vAlign w:val="center"/>
-          </w:tcPr>
-          <w:p>
-            <w:pPr>
-              <w:keepNext/>
-              <w:spacing w:before="0" w:after="0" w:line="240" w:lineRule="auto"/>
-              <w:jc w:val="right"/>
-            </w:pPr>
-            <w:r>
-              <w:rPr>
-                <w:sz w:val="17"/>
-                <w:szCs w:val="17"/>
-              </w:rPr>
-              <w:t xml:space="preserve">R$ 1,26</w:t>
+              <w:t xml:space="preserve">R$ 10,30</w:t>
             </w:r>
           </w:p>
         </w:tc>
@@ -4734,7 +4645,7 @@
         </w:trPr>
         <w:tc>
           <w:tcPr>
-            <w:tcW w:w="3761" w:type="dxa"/>
+            <w:tcW w:w="2019" w:type="dxa"/>
             <w:vAlign w:val="center"/>
           </w:tcPr>
           <w:p>
@@ -4749,13 +4660,33 @@
                 <w:sz w:val="17"/>
                 <w:szCs w:val="17"/>
               </w:rPr>
-              <w:t xml:space="preserve">Grão-de-bico cozido</w:t>
-            </w:r>
-          </w:p>
-        </w:tc>
-        <w:tc>
-          <w:tcPr>
-            <w:tcW w:w="1175" w:type="dxa"/>
+              <w:t xml:space="preserve">Vegano</w:t>
+            </w:r>
+          </w:p>
+        </w:tc>
+        <w:tc>
+          <w:tcPr>
+            <w:tcW w:w="6608" w:type="dxa"/>
+            <w:vAlign w:val="center"/>
+          </w:tcPr>
+          <w:p>
+            <w:pPr>
+              <w:keepNext/>
+              <w:spacing w:before="0" w:after="0" w:line="240" w:lineRule="auto"/>
+              <w:jc w:val="left"/>
+            </w:pPr>
+            <w:r>
+              <w:rPr>
+                <w:sz w:val="17"/>
+                <w:szCs w:val="17"/>
+              </w:rPr>
+              <w:t xml:space="preserve">3 × 1 escumadeira cheia de arroz branco cozido; 1 × 1 prato raso de macarrão cozido; 3 × 1 concha de feijão carioca cozido; 2 × 1 concha pequena de grão-de-bico cozido; 1 × 1 fatia grossa de tofu firme; 3 × 1 colher de sopa de azeite de oliva; 2 × 1 unidade de laranja pera; 1 × 3 colheres de sopa de cenoura crua</w:t>
+            </w:r>
+          </w:p>
+        </w:tc>
+        <w:tc>
+          <w:tcPr>
+            <w:tcW w:w="1011" w:type="dxa"/>
             <w:vAlign w:val="center"/>
           </w:tcPr>
           <w:p>
@@ -4769,559 +4700,7 @@
                 <w:sz w:val="17"/>
                 <w:szCs w:val="17"/>
               </w:rPr>
-              <w:t xml:space="preserve">1</w:t>
-            </w:r>
-          </w:p>
-        </w:tc>
-        <w:tc>
-          <w:tcPr>
-            <w:tcW w:w="3291" w:type="dxa"/>
-            <w:vAlign w:val="center"/>
-          </w:tcPr>
-          <w:p>
-            <w:pPr>
-              <w:keepNext/>
-              <w:spacing w:before="0" w:after="0" w:line="240" w:lineRule="auto"/>
-              <w:jc w:val="left"/>
-            </w:pPr>
-            <w:r>
-              <w:rPr>
-                <w:sz w:val="17"/>
-                <w:szCs w:val="17"/>
-              </w:rPr>
-              <w:t xml:space="preserve">1 concha pequena</w:t>
-            </w:r>
-          </w:p>
-        </w:tc>
-        <w:tc>
-          <w:tcPr>
-            <w:tcW w:w="1411" w:type="dxa"/>
-            <w:vAlign w:val="center"/>
-          </w:tcPr>
-          <w:p>
-            <w:pPr>
-              <w:keepNext/>
-              <w:spacing w:before="0" w:after="0" w:line="240" w:lineRule="auto"/>
-              <w:jc w:val="right"/>
-            </w:pPr>
-            <w:r>
-              <w:rPr>
-                <w:sz w:val="17"/>
-                <w:szCs w:val="17"/>
-              </w:rPr>
-              <w:t xml:space="preserve">R$ 0,80</w:t>
-            </w:r>
-          </w:p>
-        </w:tc>
-      </w:tr>
-      <w:tr>
-        <w:trPr>
-          <w:cantSplit/>
-        </w:trPr>
-        <w:tc>
-          <w:tcPr>
-            <w:tcW w:w="3761" w:type="dxa"/>
-            <w:vAlign w:val="center"/>
-          </w:tcPr>
-          <w:p>
-            <w:pPr>
-              <w:keepNext/>
-              <w:spacing w:before="0" w:after="0" w:line="240" w:lineRule="auto"/>
-              <w:jc w:val="left"/>
-            </w:pPr>
-            <w:r>
-              <w:rPr>
-                <w:b/>
-                <w:sz w:val="17"/>
-                <w:szCs w:val="17"/>
-              </w:rPr>
-              <w:t xml:space="preserve">Fígado bovino grelhado</w:t>
-            </w:r>
-          </w:p>
-        </w:tc>
-        <w:tc>
-          <w:tcPr>
-            <w:tcW w:w="1175" w:type="dxa"/>
-            <w:vAlign w:val="center"/>
-          </w:tcPr>
-          <w:p>
-            <w:pPr>
-              <w:keepNext/>
-              <w:spacing w:before="0" w:after="0" w:line="240" w:lineRule="auto"/>
-              <w:jc w:val="right"/>
-            </w:pPr>
-            <w:r>
-              <w:rPr>
-                <w:sz w:val="17"/>
-                <w:szCs w:val="17"/>
-              </w:rPr>
-              <w:t xml:space="preserve">1</w:t>
-            </w:r>
-          </w:p>
-        </w:tc>
-        <w:tc>
-          <w:tcPr>
-            <w:tcW w:w="3291" w:type="dxa"/>
-            <w:vAlign w:val="center"/>
-          </w:tcPr>
-          <w:p>
-            <w:pPr>
-              <w:keepNext/>
-              <w:spacing w:before="0" w:after="0" w:line="240" w:lineRule="auto"/>
-              <w:jc w:val="left"/>
-            </w:pPr>
-            <w:r>
-              <w:rPr>
-                <w:sz w:val="17"/>
-                <w:szCs w:val="17"/>
-              </w:rPr>
-              <w:t xml:space="preserve">1 bife médio</w:t>
-            </w:r>
-          </w:p>
-        </w:tc>
-        <w:tc>
-          <w:tcPr>
-            <w:tcW w:w="1411" w:type="dxa"/>
-            <w:vAlign w:val="center"/>
-          </w:tcPr>
-          <w:p>
-            <w:pPr>
-              <w:keepNext/>
-              <w:spacing w:before="0" w:after="0" w:line="240" w:lineRule="auto"/>
-              <w:jc w:val="right"/>
-            </w:pPr>
-            <w:r>
-              <w:rPr>
-                <w:sz w:val="17"/>
-                <w:szCs w:val="17"/>
-              </w:rPr>
-              <w:t xml:space="preserve">R$ 2,50</w:t>
-            </w:r>
-          </w:p>
-        </w:tc>
-      </w:tr>
-      <w:tr>
-        <w:trPr>
-          <w:cantSplit/>
-        </w:trPr>
-        <w:tc>
-          <w:tcPr>
-            <w:tcW w:w="3761" w:type="dxa"/>
-            <w:vAlign w:val="center"/>
-          </w:tcPr>
-          <w:p>
-            <w:pPr>
-              <w:keepNext/>
-              <w:spacing w:before="0" w:after="0" w:line="240" w:lineRule="auto"/>
-              <w:jc w:val="left"/>
-            </w:pPr>
-            <w:r>
-              <w:rPr>
-                <w:b/>
-                <w:sz w:val="17"/>
-                <w:szCs w:val="17"/>
-              </w:rPr>
-              <w:t xml:space="preserve">Leite integral</w:t>
-            </w:r>
-          </w:p>
-        </w:tc>
-        <w:tc>
-          <w:tcPr>
-            <w:tcW w:w="1175" w:type="dxa"/>
-            <w:vAlign w:val="center"/>
-          </w:tcPr>
-          <w:p>
-            <w:pPr>
-              <w:keepNext/>
-              <w:spacing w:before="0" w:after="0" w:line="240" w:lineRule="auto"/>
-              <w:jc w:val="right"/>
-            </w:pPr>
-            <w:r>
-              <w:rPr>
-                <w:sz w:val="17"/>
-                <w:szCs w:val="17"/>
-              </w:rPr>
-              <w:t xml:space="preserve">3</w:t>
-            </w:r>
-          </w:p>
-        </w:tc>
-        <w:tc>
-          <w:tcPr>
-            <w:tcW w:w="3291" w:type="dxa"/>
-            <w:vAlign w:val="center"/>
-          </w:tcPr>
-          <w:p>
-            <w:pPr>
-              <w:keepNext/>
-              <w:spacing w:before="0" w:after="0" w:line="240" w:lineRule="auto"/>
-              <w:jc w:val="left"/>
-            </w:pPr>
-            <w:r>
-              <w:rPr>
-                <w:sz w:val="17"/>
-                <w:szCs w:val="17"/>
-              </w:rPr>
-              <w:t xml:space="preserve">1 copo</w:t>
-            </w:r>
-          </w:p>
-        </w:tc>
-        <w:tc>
-          <w:tcPr>
-            <w:tcW w:w="1411" w:type="dxa"/>
-            <w:vAlign w:val="center"/>
-          </w:tcPr>
-          <w:p>
-            <w:pPr>
-              <w:keepNext/>
-              <w:spacing w:before="0" w:after="0" w:line="240" w:lineRule="auto"/>
-              <w:jc w:val="right"/>
-            </w:pPr>
-            <w:r>
-              <w:rPr>
-                <w:sz w:val="17"/>
-                <w:szCs w:val="17"/>
-              </w:rPr>
-              <w:t xml:space="preserve">R$ 3,30</w:t>
-            </w:r>
-          </w:p>
-        </w:tc>
-      </w:tr>
-      <w:tr>
-        <w:trPr>
-          <w:cantSplit/>
-        </w:trPr>
-        <w:tc>
-          <w:tcPr>
-            <w:tcW w:w="3761" w:type="dxa"/>
-            <w:vAlign w:val="center"/>
-          </w:tcPr>
-          <w:p>
-            <w:pPr>
-              <w:keepNext/>
-              <w:spacing w:before="0" w:after="0" w:line="240" w:lineRule="auto"/>
-              <w:jc w:val="left"/>
-            </w:pPr>
-            <w:r>
-              <w:rPr>
-                <w:b/>
-                <w:sz w:val="17"/>
-                <w:szCs w:val="17"/>
-              </w:rPr>
-              <w:t xml:space="preserve">Pasta de amendoim integral</w:t>
-            </w:r>
-          </w:p>
-        </w:tc>
-        <w:tc>
-          <w:tcPr>
-            <w:tcW w:w="1175" w:type="dxa"/>
-            <w:vAlign w:val="center"/>
-          </w:tcPr>
-          <w:p>
-            <w:pPr>
-              <w:keepNext/>
-              <w:spacing w:before="0" w:after="0" w:line="240" w:lineRule="auto"/>
-              <w:jc w:val="right"/>
-            </w:pPr>
-            <w:r>
-              <w:rPr>
-                <w:sz w:val="17"/>
-                <w:szCs w:val="17"/>
-              </w:rPr>
-              <w:t xml:space="preserve">2</w:t>
-            </w:r>
-          </w:p>
-        </w:tc>
-        <w:tc>
-          <w:tcPr>
-            <w:tcW w:w="3291" w:type="dxa"/>
-            <w:vAlign w:val="center"/>
-          </w:tcPr>
-          <w:p>
-            <w:pPr>
-              <w:keepNext/>
-              <w:spacing w:before="0" w:after="0" w:line="240" w:lineRule="auto"/>
-              <w:jc w:val="left"/>
-            </w:pPr>
-            <w:r>
-              <w:rPr>
-                <w:sz w:val="17"/>
-                <w:szCs w:val="17"/>
-              </w:rPr>
-              <w:t xml:space="preserve">1 colher de sopa</w:t>
-            </w:r>
-          </w:p>
-        </w:tc>
-        <w:tc>
-          <w:tcPr>
-            <w:tcW w:w="1411" w:type="dxa"/>
-            <w:vAlign w:val="center"/>
-          </w:tcPr>
-          <w:p>
-            <w:pPr>
-              <w:keepNext/>
-              <w:spacing w:before="0" w:after="0" w:line="240" w:lineRule="auto"/>
-              <w:jc w:val="right"/>
-            </w:pPr>
-            <w:r>
-              <w:rPr>
-                <w:sz w:val="17"/>
-                <w:szCs w:val="17"/>
-              </w:rPr>
-              <w:t xml:space="preserve">R$ 1,40</w:t>
-            </w:r>
-          </w:p>
-        </w:tc>
-      </w:tr>
-      <w:tr>
-        <w:trPr>
-          <w:cantSplit/>
-        </w:trPr>
-        <w:tc>
-          <w:tcPr>
-            <w:tcW w:w="3761" w:type="dxa"/>
-            <w:vAlign w:val="center"/>
-          </w:tcPr>
-          <w:p>
-            <w:pPr>
-              <w:keepNext/>
-              <w:spacing w:before="0" w:after="0" w:line="240" w:lineRule="auto"/>
-              <w:jc w:val="left"/>
-            </w:pPr>
-            <w:r>
-              <w:rPr>
-                <w:b/>
-                <w:sz w:val="17"/>
-                <w:szCs w:val="17"/>
-              </w:rPr>
-              <w:t xml:space="preserve">Laranja pera</w:t>
-            </w:r>
-          </w:p>
-        </w:tc>
-        <w:tc>
-          <w:tcPr>
-            <w:tcW w:w="1175" w:type="dxa"/>
-            <w:vAlign w:val="center"/>
-          </w:tcPr>
-          <w:p>
-            <w:pPr>
-              <w:keepNext/>
-              <w:spacing w:before="0" w:after="0" w:line="240" w:lineRule="auto"/>
-              <w:jc w:val="right"/>
-            </w:pPr>
-            <w:r>
-              <w:rPr>
-                <w:sz w:val="17"/>
-                <w:szCs w:val="17"/>
-              </w:rPr>
-              <w:t xml:space="preserve">2</w:t>
-            </w:r>
-          </w:p>
-        </w:tc>
-        <w:tc>
-          <w:tcPr>
-            <w:tcW w:w="3291" w:type="dxa"/>
-            <w:vAlign w:val="center"/>
-          </w:tcPr>
-          <w:p>
-            <w:pPr>
-              <w:keepNext/>
-              <w:spacing w:before="0" w:after="0" w:line="240" w:lineRule="auto"/>
-              <w:jc w:val="left"/>
-            </w:pPr>
-            <w:r>
-              <w:rPr>
-                <w:sz w:val="17"/>
-                <w:szCs w:val="17"/>
-              </w:rPr>
-              <w:t xml:space="preserve">1 unidade</w:t>
-            </w:r>
-          </w:p>
-        </w:tc>
-        <w:tc>
-          <w:tcPr>
-            <w:tcW w:w="1411" w:type="dxa"/>
-            <w:vAlign w:val="center"/>
-          </w:tcPr>
-          <w:p>
-            <w:pPr>
-              <w:keepNext/>
-              <w:spacing w:before="0" w:after="0" w:line="240" w:lineRule="auto"/>
-              <w:jc w:val="right"/>
-            </w:pPr>
-            <w:r>
-              <w:rPr>
-                <w:sz w:val="17"/>
-                <w:szCs w:val="17"/>
-              </w:rPr>
-              <w:t xml:space="preserve">R$ 1,44</w:t>
-            </w:r>
-          </w:p>
-        </w:tc>
-      </w:tr>
-      <w:tr>
-        <w:trPr>
-          <w:cantSplit/>
-        </w:trPr>
-        <w:tc>
-          <w:tcPr>
-            <w:tcW w:w="3761" w:type="dxa"/>
-            <w:vAlign w:val="center"/>
-          </w:tcPr>
-          <w:p>
-            <w:pPr>
-              <w:keepNext/>
-              <w:spacing w:before="0" w:after="0" w:line="240" w:lineRule="auto"/>
-              <w:jc w:val="left"/>
-            </w:pPr>
-            <w:r>
-              <w:rPr>
-                <w:b/>
-                <w:sz w:val="17"/>
-                <w:szCs w:val="17"/>
-              </w:rPr>
-              <w:t xml:space="preserve">Cenoura crua</w:t>
-            </w:r>
-          </w:p>
-        </w:tc>
-        <w:tc>
-          <w:tcPr>
-            <w:tcW w:w="1175" w:type="dxa"/>
-            <w:vAlign w:val="center"/>
-          </w:tcPr>
-          <w:p>
-            <w:pPr>
-              <w:keepNext/>
-              <w:spacing w:before="0" w:after="0" w:line="240" w:lineRule="auto"/>
-              <w:jc w:val="right"/>
-            </w:pPr>
-            <w:r>
-              <w:rPr>
-                <w:sz w:val="17"/>
-                <w:szCs w:val="17"/>
-              </w:rPr>
-              <w:t xml:space="preserve">1</w:t>
-            </w:r>
-          </w:p>
-        </w:tc>
-        <w:tc>
-          <w:tcPr>
-            <w:tcW w:w="3291" w:type="dxa"/>
-            <w:vAlign w:val="center"/>
-          </w:tcPr>
-          <w:p>
-            <w:pPr>
-              <w:keepNext/>
-              <w:spacing w:before="0" w:after="0" w:line="240" w:lineRule="auto"/>
-              <w:jc w:val="left"/>
-            </w:pPr>
-            <w:r>
-              <w:rPr>
-                <w:sz w:val="17"/>
-                <w:szCs w:val="17"/>
-              </w:rPr>
-              <w:t xml:space="preserve">3 colheres de sopa</w:t>
-            </w:r>
-          </w:p>
-        </w:tc>
-        <w:tc>
-          <w:tcPr>
-            <w:tcW w:w="1411" w:type="dxa"/>
-            <w:vAlign w:val="center"/>
-          </w:tcPr>
-          <w:p>
-            <w:pPr>
-              <w:keepNext/>
-              <w:spacing w:before="0" w:after="0" w:line="240" w:lineRule="auto"/>
-              <w:jc w:val="right"/>
-            </w:pPr>
-            <w:r>
-              <w:rPr>
-                <w:sz w:val="17"/>
-                <w:szCs w:val="17"/>
-              </w:rPr>
-              <w:t xml:space="preserve">R$ 0,30</w:t>
-            </w:r>
-          </w:p>
-        </w:tc>
-      </w:tr>
-      <w:tr>
-        <w:trPr>
-          <w:cantSplit/>
-        </w:trPr>
-        <w:tc>
-          <w:tcPr>
-            <w:tcW w:w="3761" w:type="dxa"/>
-            <w:vAlign w:val="center"/>
-          </w:tcPr>
-          <w:p>
-            <w:pPr>
-              <w:spacing w:before="0" w:after="0" w:line="240" w:lineRule="auto"/>
-              <w:jc w:val="left"/>
-            </w:pPr>
-            <w:r>
-              <w:rPr>
-                <w:b/>
-                <w:sz w:val="17"/>
-                <w:szCs w:val="17"/>
-              </w:rPr>
-              <w:t xml:space="preserve">Total</w:t>
-            </w:r>
-          </w:p>
-        </w:tc>
-        <w:tc>
-          <w:tcPr>
-            <w:tcW w:w="1175" w:type="dxa"/>
-            <w:vAlign w:val="center"/>
-          </w:tcPr>
-          <w:p>
-            <w:pPr>
-              <w:spacing w:before="0" w:after="0" w:line="240" w:lineRule="auto"/>
-              <w:jc w:val="right"/>
-            </w:pPr>
-            <w:r>
-              <w:rPr>
-                <w:sz w:val="17"/>
-                <w:szCs w:val="17"/>
-              </w:rPr>
-              <w:t xml:space="preserve"/>
-            </w:r>
-          </w:p>
-        </w:tc>
-        <w:tc>
-          <w:tcPr>
-            <w:tcW w:w="3291" w:type="dxa"/>
-            <w:vAlign w:val="center"/>
-          </w:tcPr>
-          <w:p>
-            <w:pPr>
-              <w:spacing w:before="0" w:after="0" w:line="240" w:lineRule="auto"/>
-              <w:jc w:val="left"/>
-            </w:pPr>
-            <w:r>
-              <w:rPr>
-                <w:sz w:val="17"/>
-                <w:szCs w:val="17"/>
-              </w:rPr>
-              <w:t xml:space="preserve"/>
-            </w:r>
-          </w:p>
-        </w:tc>
-        <w:tc>
-          <w:tcPr>
-            <w:tcW w:w="1411" w:type="dxa"/>
-            <w:vAlign w:val="center"/>
-          </w:tcPr>
-          <w:p>
-            <w:pPr>
-              <w:spacing w:before="0" w:after="0" w:line="240" w:lineRule="auto"/>
-              <w:jc w:val="right"/>
-            </w:pPr>
-            <w:r>
-              <w:rPr>
-                <w:sz w:val="17"/>
-                <w:szCs w:val="17"/>
-              </w:rPr>
-              <w:t xml:space="preserve">R$ 14,45</w:t>
+              <w:t xml:space="preserve">R$ 11,30</w:t>
             </w:r>
           </w:p>
         </w:tc>
@@ -5339,7 +4718,7 @@
           <w:sz w:val="16"/>
           <w:szCs w:val="16"/>
         </w:rPr>
-        <w:t xml:space="preserve">Fonte: elaboração do grupo. Os cardápios dos nove perfis estão em resultados/cardapios.md.</w:t>
+        <w:t xml:space="preserve">Fonte: elaboração do grupo. Os cardápios dos nove perfis, com os totais de nutrientes, estão em resultados/cardapios.md.</w:t>
       </w:r>
     </w:p>
     <w:p>
@@ -5447,7 +4826,7 @@
           <w:sz w:val="17"/>
           <w:szCs w:val="17"/>
         </w:rPr>
-        <w:t xml:space="preserve">Figura 8 – Interface web: atleta, custo mínimo, Simplex</w:t>
+        <w:t xml:space="preserve">Figura 8 – Interface web: atleta, custo mínimo, Simplex (resumo e cardápio do dia)</w:t>
       </w:r>
     </w:p>
     <w:p>
@@ -5458,7 +4837,7 @@
       <w:r>
         <w:drawing>
           <wp:inline>
-            <wp:extent cx="4320000" cy="5915314"/>
+            <wp:extent cx="3240000" cy="5727857"/>
             <wp:docPr id="18" name="Picture 18"/>
             <wp:cNvGraphicFramePr>
               <a:graphicFrameLocks noChangeAspect="1"/>
@@ -5467,7 +4846,7 @@
               <a:graphicData uri="http://schemas.openxmlformats.org/drawingml/2006/picture">
                 <pic:pic>
                   <pic:nvPicPr>
-                    <pic:cNvPr id="0" name="web_simplex.png"/>
+                    <pic:cNvPr id="0" name="web_simplex_topo.png"/>
                     <pic:cNvPicPr/>
                   </pic:nvPicPr>
                   <pic:blipFill>
@@ -5479,7 +4858,7 @@
                   <pic:spPr>
                     <a:xfrm>
                       <a:off x="0" y="0"/>
-                      <a:ext cx="4320000" cy="5915314"/>
+                      <a:ext cx="3240000" cy="5727857"/>
                     </a:xfrm>
                     <a:prstGeom prst="rect"/>
                   </pic:spPr>
@@ -5642,7 +5021,7 @@
           <w:sz w:val="22"/>
           <w:szCs w:val="22"/>
         </w:rPr>
-        <w:t xml:space="preserve">HOLLAND, J. H. </w:t>
+        <w:t xml:space="preserve">FORREST, J.; LOUGEE-HEIMER, R. CBC user guide. In: </w:t>
       </w:r>
       <w:r>
         <w:rPr>
@@ -5650,14 +5029,14 @@
           <w:sz w:val="22"/>
           <w:szCs w:val="22"/>
         </w:rPr>
-        <w:t xml:space="preserve">Adaptation in natural and artificial systems</w:t>
-      </w:r>
-      <w:r>
-        <w:rPr>
-          <w:sz w:val="22"/>
-          <w:szCs w:val="22"/>
-        </w:rPr>
-        <w:t xml:space="preserve">. Ann Arbor: University of Michigan Press, 1975.</w:t>
+        <w:t xml:space="preserve">INFORMS Tutorials in Operations Research</w:t>
+      </w:r>
+      <w:r>
+        <w:rPr>
+          <w:sz w:val="22"/>
+          <w:szCs w:val="22"/>
+        </w:rPr>
+        <w:t xml:space="preserve">. INFORMS, 2005. p. 257–277.</w:t>
       </w:r>
     </w:p>
     <w:p>
@@ -5670,7 +5049,7 @@
           <w:sz w:val="22"/>
           <w:szCs w:val="22"/>
         </w:rPr>
-        <w:t xml:space="preserve">INSTITUTE OF MEDICINE. </w:t>
+        <w:t xml:space="preserve">HOLLAND, J. H. </w:t>
       </w:r>
       <w:r>
         <w:rPr>
@@ -5678,14 +5057,14 @@
           <w:sz w:val="22"/>
           <w:szCs w:val="22"/>
         </w:rPr>
-        <w:t xml:space="preserve">Dietary reference intakes: the essential guide to nutrient requirements</w:t>
-      </w:r>
-      <w:r>
-        <w:rPr>
-          <w:sz w:val="22"/>
-          <w:szCs w:val="22"/>
-        </w:rPr>
-        <w:t xml:space="preserve">. Washington, DC: The National Academies Press, 2006.</w:t>
+        <w:t xml:space="preserve">Adaptation in natural and artificial systems</w:t>
+      </w:r>
+      <w:r>
+        <w:rPr>
+          <w:sz w:val="22"/>
+          <w:szCs w:val="22"/>
+        </w:rPr>
+        <w:t xml:space="preserve">. Ann Arbor: University of Michigan Press, 1975.</w:t>
       </w:r>
     </w:p>
     <w:p>
@@ -5698,7 +5077,7 @@
           <w:sz w:val="22"/>
           <w:szCs w:val="22"/>
         </w:rPr>
-        <w:t xml:space="preserve">LAND, A. H.; DOIG, A. G. An automatic method of solving discrete programming problems. </w:t>
+        <w:t xml:space="preserve">INSTITUTE OF MEDICINE. </w:t>
       </w:r>
       <w:r>
         <w:rPr>
@@ -5706,14 +5085,14 @@
           <w:sz w:val="22"/>
           <w:szCs w:val="22"/>
         </w:rPr>
-        <w:t xml:space="preserve">Econometrica</w:t>
-      </w:r>
-      <w:r>
-        <w:rPr>
-          <w:sz w:val="22"/>
-          <w:szCs w:val="22"/>
-        </w:rPr>
-        <w:t xml:space="preserve">, v. 28, n. 3, p. 497–520, 1960.</w:t>
+        <w:t xml:space="preserve">Dietary reference intakes: the essential guide to nutrient requirements</w:t>
+      </w:r>
+      <w:r>
+        <w:rPr>
+          <w:sz w:val="22"/>
+          <w:szCs w:val="22"/>
+        </w:rPr>
+        <w:t xml:space="preserve">. Washington, DC: The National Academies Press, 2006.</w:t>
       </w:r>
     </w:p>
     <w:p>
@@ -5726,7 +5105,7 @@
           <w:sz w:val="22"/>
           <w:szCs w:val="22"/>
         </w:rPr>
-        <w:t xml:space="preserve">NEPA-UNICAMP. </w:t>
+        <w:t xml:space="preserve">LAND, A. H.; DOIG, A. G. An automatic method of solving discrete programming problems. </w:t>
       </w:r>
       <w:r>
         <w:rPr>
@@ -5734,14 +5113,14 @@
           <w:sz w:val="22"/>
           <w:szCs w:val="22"/>
         </w:rPr>
-        <w:t xml:space="preserve">Tabela brasileira de composição de alimentos – TACO</w:t>
-      </w:r>
-      <w:r>
-        <w:rPr>
-          <w:sz w:val="22"/>
-          <w:szCs w:val="22"/>
-        </w:rPr>
-        <w:t xml:space="preserve">. 4. ed. Campinas: NEPA-UNICAMP, 2011.</w:t>
+        <w:t xml:space="preserve">Econometrica</w:t>
+      </w:r>
+      <w:r>
+        <w:rPr>
+          <w:sz w:val="22"/>
+          <w:szCs w:val="22"/>
+        </w:rPr>
+        <w:t xml:space="preserve">, v. 28, n. 3, p. 497–520, 1960.</w:t>
       </w:r>
     </w:p>
     <w:p>
@@ -5754,7 +5133,7 @@
           <w:sz w:val="22"/>
           <w:szCs w:val="22"/>
         </w:rPr>
-        <w:t xml:space="preserve">STIGLER, G. J. The cost of subsistence. </w:t>
+        <w:t xml:space="preserve">NEPA-UNICAMP. </w:t>
       </w:r>
       <w:r>
         <w:rPr>
@@ -5762,14 +5141,14 @@
           <w:sz w:val="22"/>
           <w:szCs w:val="22"/>
         </w:rPr>
-        <w:t xml:space="preserve">Journal of Farm Economics</w:t>
-      </w:r>
-      <w:r>
-        <w:rPr>
-          <w:sz w:val="22"/>
-          <w:szCs w:val="22"/>
-        </w:rPr>
-        <w:t xml:space="preserve">, v. 27, n. 2, p. 303–314, 1945.</w:t>
+        <w:t xml:space="preserve">Tabela brasileira de composição de alimentos – TACO</w:t>
+      </w:r>
+      <w:r>
+        <w:rPr>
+          <w:sz w:val="22"/>
+          <w:szCs w:val="22"/>
+        </w:rPr>
+        <w:t xml:space="preserve">. 4. ed. Campinas: NEPA-UNICAMP, 2011.</w:t>
       </w:r>
     </w:p>
     <w:p>
@@ -5782,6 +5161,34 @@
           <w:sz w:val="22"/>
           <w:szCs w:val="22"/>
         </w:rPr>
+        <w:t xml:space="preserve">STIGLER, G. J. The cost of subsistence. </w:t>
+      </w:r>
+      <w:r>
+        <w:rPr>
+          <w:i/>
+          <w:sz w:val="22"/>
+          <w:szCs w:val="22"/>
+        </w:rPr>
+        <w:t xml:space="preserve">Journal of Farm Economics</w:t>
+      </w:r>
+      <w:r>
+        <w:rPr>
+          <w:sz w:val="22"/>
+          <w:szCs w:val="22"/>
+        </w:rPr>
+        <w:t xml:space="preserve">, v. 27, n. 2, p. 303–314, 1945.</w:t>
+      </w:r>
+    </w:p>
+    <w:p>
+      <w:pPr>
+        <w:spacing w:before="0" w:after="140" w:line="276" w:lineRule="auto"/>
+        <w:jc w:val="left"/>
+      </w:pPr>
+      <w:r>
+        <w:rPr>
+          <w:sz w:val="22"/>
+          <w:szCs w:val="22"/>
+        </w:rPr>
         <w:t xml:space="preserve">THOMAS, D. T.; ERDMAN, K. A.; BURKE, L. M. American College of Sports Medicine joint position statement: nutrition and athletic performance. </w:t>
       </w:r>
       <w:r>
@@ -5798,6 +5205,34 @@
           <w:szCs w:val="22"/>
         </w:rPr>
         <w:t xml:space="preserve">, v. 48, n. 3, p. 543–568, 2016.</w:t>
+      </w:r>
+    </w:p>
+    <w:p>
+      <w:pPr>
+        <w:spacing w:before="0" w:after="140" w:line="276" w:lineRule="auto"/>
+        <w:jc w:val="left"/>
+      </w:pPr>
+      <w:r>
+        <w:rPr>
+          <w:sz w:val="22"/>
+          <w:szCs w:val="22"/>
+        </w:rPr>
+        <w:t xml:space="preserve">U.S. DEPARTMENT OF AGRICULTURE. Agricultural Research Service. </w:t>
+      </w:r>
+      <w:r>
+        <w:rPr>
+          <w:i/>
+          <w:sz w:val="22"/>
+          <w:szCs w:val="22"/>
+        </w:rPr>
+        <w:t xml:space="preserve">FoodData Central: SR Legacy</w:t>
+      </w:r>
+      <w:r>
+        <w:rPr>
+          <w:sz w:val="22"/>
+          <w:szCs w:val="22"/>
+        </w:rPr>
+        <w:t xml:space="preserve">. 2019. Disponível em: https://fdc.nal.usda.gov.</w:t>
       </w:r>
     </w:p>
     <w:p>

</xml_diff>